<commit_message>
report: refine title to a cleaner colon form with balanced line breaks
Vision-Only Reactive Corridor Navigation for a Quadruped: Reusing a
Frozen Velocity Policy with a Hard Passage Gate. Fixes the orphaned-word
wrapping ("Quadruped"/"Gate" alone on a line) in both pipelines.
</commit_message>
<xml_diff>
--- a/report/go2_technical_report.docx
+++ b/report/go2_technical_report.docx
@@ -10,19 +10,19 @@
         <w:t xml:space="preserve">Go2 Ball-Follower Technical Report</w:t>
       </w:r>
     </w:p>
-    <w:bookmarkStart w:id="40" w:name="X8911a9c776fc67897b23129d19b441bfa157ad9"/>
+    <w:bookmarkStart w:id="40" w:name="X3032cf20d11a266a6b60311cc368039eb6ee8cc"/>
     <w:p>
       <w:pPr>
         <w:pStyle w:val="Heading1"/>
       </w:pPr>
       <w:r>
-        <w:t xml:space="preserve">Vision-Only Reactive Corridor Navigation for a Quadruped</w:t>
+        <w:t xml:space="preserve">Vision-Only Reactive Corridor Navigation for a Quadruped:</w:t>
       </w:r>
       <w:r>
         <w:br/>
       </w:r>
       <w:r>
-        <w:t xml:space="preserve">using a Frozen Velocity Policy and a Hard Passage Gate</w:t>
+        <w:t xml:space="preserve">Reusing a Frozen Velocity Policy with a Hard Passage Gate</w:t>
       </w:r>
     </w:p>
     <w:p>

</xml_diff>